<commit_message>
Report: add Phase 11 (brutal-honesty round) and Phase 12 (rPPG/threshold/testing fixes)
The report stopped at Phase 10 -- everything since (the security-hardening
round across security/testing/UI/production, the critical live regression
found and fixed by testing its own fix, the real-image replay-signal
calibration, the Docker disk crisis, the admin console restoration, and
this session's rPPG bandpass fix, matching-threshold sweep, and testing-
rigor work) was undocumented. Adds Phase 11 and Phase 12 in the same
"what we tried / what real testing found" structure as every other phase,
and updates three stale bullets in "What Works Today" (rPPG's real
still-broken status, the 0.38 threshold, 43 tests / 62% coverage) plus one
new "What Is Still Open" item for rPPG's real architectural limit.

Co-Authored-By: Claude Sonnet 5 <noreply@anthropic.com>
</commit_message>
<xml_diff>
--- a/docs/Final_Report_Full.docx
+++ b/docs/Final_Report_Full.docx
@@ -2387,6 +2387,154 @@
     </w:p>
     <w:p>
       <w:pPr>
+        <w:pStyle w:val="Heading2"/>
+      </w:pPr>
+      <w:r>
+        <w:t>Phase 11: A Brutally Honest Score, and Closing Nine Real Gaps</w:t>
+      </w:r>
+    </w:p>
+    <w:p>
+      <w:pPr/>
+      <w:r>
+        <w:t>What we were trying to do: Phase 10 had just added real, measured numbers and fixed the two-button security bypass. The natural next question was the same one Phase 7 had already asked once before: score this honestly, across every dimension that actually matters for a real deployment -- not just "does it work," but security depth, testing rigor, interface polish, and production readiness -- and then fix what the score actually finds, one weak area at a time, verifying each fix against the real running app before moving to the next.</w:t>
+      </w:r>
+    </w:p>
+    <w:p>
+      <w:pPr/>
+      <w:r>
+        <w:t>What real testing found: breaking the work into four areas and fixing each in turn surfaced one especially serious problem hiding inside the fix for another, plus a long list of smaller, real gaps closed the same way this project closes everything -- by measuring, not assuming.</w:t>
+      </w:r>
+    </w:p>
+    <w:p>
+      <w:pPr>
+        <w:pStyle w:val="ListBullet"/>
+      </w:pPr>
+      <w:r>
+        <w:t>The active-liveness challenge (blink or head-turn) was moved from something every capture path had to remember to check, to a structural gate built into the two functions that can actually cause a verification or enrollment decision. Testing that exact fix immediately found a critical regression: the new gate was being checked after the calling code had already reset the flag it depended on, so every single genuine live verification attempt failed against its own new safeguard. Caught the same day via live testing with a real user, not a lucky guess, and fixed by reordering the reset to happen after the check, not before -- then re-confirmed live with a real, successful verification.</w:t>
+      </w:r>
+    </w:p>
+    <w:p>
+      <w:pPr>
+        <w:pStyle w:val="ListBullet"/>
+      </w:pPr>
+      <w:r>
+        <w:t>A new replay-loop detector was built for the active-liveness window: it downsamples each frame small and watches for the same frame content reappearing later in the same attempt, the way a looped recording would repeat but a real, live, moving person essentially never does. Tested directly against a recorded blink attack, looped to fill a realistic 20-second attempt window: it caught the loop well before the blink pattern would have otherwise appeared to pass.</w:t>
+      </w:r>
+    </w:p>
+    <w:p>
+      <w:pPr>
+        <w:pStyle w:val="ListBullet"/>
+      </w:pPr>
+      <w:r>
+        <w:t>Two candidate replay-detection signals -- a trained anti-spoofing model reused from Layer 1, and a cheap, non-AI "screen surface texture" check -- were calibrated against real captured attack and genuine photos instead of tuned on a couple of live trials. The trained model caught 4 of 4 real screen/phone replay photos with a false-alarm rate of 2 of 9 genuine photos. The cheap check caught 0 of 4 real attacks and false-alarmed on 3 of 9 genuine photos -- pure downside, no benefit. It was removed from the pass/fail decision entirely (kept only for visibility in logs), rather than kept out of inertia.</w:t>
+      </w:r>
+    </w:p>
+    <w:p>
+      <w:pPr>
+        <w:pStyle w:val="ListBullet"/>
+      </w:pPr>
+      <w:r>
+        <w:t>A real automated test suite and continuous-integration pipeline were built for the first time: a backend job running the full test suite against the real ML stack, a separate lightweight job running cross-browser interface tests (Chromium, Firefox, WebKit, both light and dark mode) with Playwright, and a rule that fails a pull request if interface files change without their tests changing too. One of the new interface tests was deliberately proven to actually catch a real regression, not just pass vacuously: a known color fix was briefly undone, the test failed exactly as expected, then the fix was restored.</w:t>
+      </w:r>
+    </w:p>
+    <w:p>
+      <w:pPr>
+        <w:pStyle w:val="ListBullet"/>
+      </w:pPr>
+      <w:r>
+        <w:t>Interface alert boxes (errors, warnings, success messages) were moved from one-off inline styling repeated in four separate places to a single shared CSS class, reusing the exact same color tokens already used elsewhere for consistency, so a future color or contrast fix only has to happen once.</w:t>
+      </w:r>
+    </w:p>
+    <w:p>
+      <w:pPr>
+        <w:pStyle w:val="ListBullet"/>
+      </w:pPr>
+      <w:r>
+        <w:t>The project was containerized with Docker for the first time. The first build measured 13.2 GB, almost entirely unused GPU libraries pulled in by a default install; pointing the install at a CPU-only package source and rebuilding measured 6.7 GB -- confirmed by actually building both versions and comparing the real result, not estimated.</w:t>
+      </w:r>
+    </w:p>
+    <w:p>
+      <w:pPr>
+        <w:pStyle w:val="ListBullet"/>
+      </w:pPr>
+      <w:r>
+        <w:t>While simplifying the admin-facing screens earlier in this project, real working features -- the right-to-be-forgotten deletion tool, the audit-trail viewer, and system health checks -- had been accidentally removed, not intentionally retired. Found by checking the project's own history, not by a user report, and restored as a separate admin console app, run on its own port, so page-load-time PII exposure is now isolated to a single restrictable entry point instead of living inside the main consumer-facing app.</w:t>
+      </w:r>
+    </w:p>
+    <w:p>
+      <w:pPr>
+        <w:pStyle w:val="ListBullet"/>
+      </w:pPr>
+      <w:r>
+        <w:t>Building the Docker image filled the development machine's main drive to zero bytes free mid-build. Diagnosed properly rather than just deleting things: found Docker's real multi-gigabyte data disk living inside its own internal virtual-machine layer, moved that file to a drive with space, and left a transparent link in its original location so nothing else on the machine had to change. Confirmed the move didn't disturb any of the machine's other, unrelated existing containers.</w:t>
+      </w:r>
+    </w:p>
+    <w:p>
+      <w:pPr/>
+      <w:r>
+        <w:t>None of this changed what a genuine user experiences step by step. It changed how much of the system's own claims about itself are backed by a real, repeatable measurement instead of an assumption -- including, this time, a measurement that caught a bug in the very fix meant to make things safer.</w:t>
+      </w:r>
+    </w:p>
+    <w:p>
+      <w:pPr>
+        <w:pStyle w:val="Heading2"/>
+      </w:pPr>
+      <w:r>
+        <w:t>Phase 12: One More Honest Pass -- a Silent rPPG Failure, a Free Accuracy Win, and Real Test Coverage</w:t>
+      </w:r>
+    </w:p>
+    <w:p>
+      <w:pPr/>
+      <w:r>
+        <w:t>What we were trying to do: with the four-area honesty round closed out, the same live-testing discipline was pointed at whatever was left. Rather than assume Phase 11's fixes were the end of it, the live debug logs from actual camera sessions were checked directly for anything still quietly going wrong.</w:t>
+      </w:r>
+    </w:p>
+    <w:p>
+      <w:pPr/>
+      <w:r>
+        <w:t>What real testing found: the heartbeat-pattern check (Layer 3, rPPG) had been silently failing on every single real attempt this session, and the deployed face-matching threshold turned out not to be the best point on its own calibration curve.</w:t>
+      </w:r>
+    </w:p>
+    <w:p>
+      <w:pPr>
+        <w:pStyle w:val="ListBullet"/>
+      </w:pPr>
+      <w:r>
+        <w:t>Every rPPG evaluation logged during real live sessions had been erroring with a cryptic filter-math message, not passing or failing. The real cause: the live app was only managing about 1 genuinely new camera frame every 1 to 2 seconds during the check window, far below the roughly 8 frames a second a heartbeat signal in the target frequency range actually needs -- a limit the math simply cannot be tricked around. Fixed the check to fail with a clear, specific, honest reason instead of a confusing one, and to use a smaller, still-valid frequency range when the real sample rate allows it rather than demanding the full range every time. Also found and fixed a real contributor to the slow frame rate itself: a trained anti-spoofing model call meant to run at most once a second was, in practice, running on almost every single tick, because its own one-second limit was shorter than how long a tick already took.</w:t>
+      </w:r>
+    </w:p>
+    <w:p>
+      <w:pPr>
+        <w:pStyle w:val="ListBullet"/>
+      </w:pPr>
+      <w:r>
+        <w:t>The deployed face-matching threshold (0.40) had only ever been reported at that one single point. Sweeping it across a full range of candidate values, against the exact same real calibration data the original number came from, found that 0.38 gives the identical false-accept rate -- the same two impostor pairs out of 595 real cross-identity pairs accepted, no extra security risk -- while correctly accepting one more genuine person out of 106 real test pairs than 0.40 did. The deployed threshold was moved to 0.38 on that evidence, and the calibration report was updated with the full sweep table so the reasoning is checkable, not just asserted.</w:t>
+      </w:r>
+    </w:p>
+    <w:p>
+      <w:pPr>
+        <w:pStyle w:val="ListBullet"/>
+      </w:pPr>
+      <w:r>
+        <w:t>Measuring real automated test coverage for the first time (rather than just counting how many tests exist) found it sitting at 50%, with two real files at 0% and a security-relevant replay detector -- proven effective earlier in Phase 11 only through a one-off manual script -- carrying no permanent protection at all. Writing real tests for the replay detector, the duplicate-registration check, the screen-texture check, and the core face-embedding function raised coverage to 62% and the test count from 26 to 43. Writing the very first test for the duplicate-registration check also found a real bug: it was quietly reading and trying to decrypt the actual production database with the wrong key during tests, because of a stray import pattern that created a second, disconnected copy of the database module -- fixed at the source, not worked around in the test.</w:t>
+      </w:r>
+    </w:p>
+    <w:p>
+      <w:pPr>
+        <w:pStyle w:val="ListBullet"/>
+      </w:pPr>
+      <w:r>
+        <w:t>A fourth area, the standalone single-script registration flow written early in the project, was confirmed to be dead code: nothing in the live app, the API, or the main verification pipeline calls it anymore, only an old development script does. Left untested and unchanged rather than writing coverage that would protect a path no real user ever takes.</w:t>
+      </w:r>
+    </w:p>
+    <w:p>
+      <w:pPr/>
+      <w:r>
+        <w:t>The theme across both of these last two phases is the same one this whole project keeps returning to: a claim is not true until it has been checked against something real -- a real log, a real calibration sample, a real test run -- and when that check finds something wrong, the honest move is to say so plainly and fix the real cause, not the symptom that happened to be visible first.</w:t>
+      </w:r>
+    </w:p>
+    <w:p>
+      <w:pPr>
         <w:pStyle w:val="Heading1"/>
       </w:pPr>
       <w:r>
@@ -2435,7 +2583,7 @@
         <w:spacing w:after="120"/>
       </w:pPr>
       <w:r>
-        <w:t>The heartbeat/pulse check (Layer 3, rPPG) is wired into Verify Identity, collecting a physiological signal silently in the background during the same window as the Layer 2 challenge, rather than as a separate wait. As of Phase 8, it is a secondary, advisory signal rather than a hard pass/fail gate, since a webcam-based pulse reading proved noisy enough in real testing to occasionally reject a genuinely live person; it is still measured and shown, but face matching and the active gesture check now carry the actual decision.</w:t>
+        <w:t>The heartbeat/pulse check (Layer 3, rPPG) is wired into Verify Identity and collects a signal silently in the background during the same window as the Layer 2 challenge. As described in Phase 12, it has not yet produced a real pass or fail on this machine's camera setup -- the live frame rate during that window is too low for the check's underlying math, a hardware/architecture limit, not a bug. It now fails with a clear, honest reason instead of a confusing one, and remains a secondary, advisory signal, never a hard gate.</w:t>
       </w:r>
     </w:p>
     <w:p>
@@ -2444,7 +2592,7 @@
         <w:spacing w:after="120"/>
       </w:pPr>
       <w:r>
-        <w:t>Face matching runs against a calibrated, real-data-tested threshold, and, since a Phase 9 fix described below, now returns a consistent score for the same person on repeated attempts instead of quietly degrading after the first one.</w:t>
+        <w:t>Face matching runs against a calibrated, real-data-tested threshold -- re-swept in Phase 12 across a full range of candidate values against the same real calibration data, moved from 0.40 to 0.38 for a small, verified accuracy improvement at no measured security cost -- and, since a Phase 9 fix described below, now returns a consistent score for the same person on repeated attempts instead of quietly degrading after the first one.</w:t>
       </w:r>
     </w:p>
     <w:p>
@@ -2520,7 +2668,7 @@
         <w:spacing w:after="120"/>
       </w:pPr>
       <w:r>
-        <w:t>An automated test suite covering all of the above passes in full.</w:t>
+        <w:t>An automated test suite covering all of the above passes in full -- 43 tests as of Phase 12 (up from 26), measuring 62% real line coverage of the core logic, with continuous integration running the full backend suite plus cross-browser interface tests on every change.</w:t>
       </w:r>
     </w:p>
     <w:p>
@@ -2650,6 +2798,14 @@
       </w:r>
       <w:r>
         <w:t>out.</w:t>
+      </w:r>
+    </w:p>
+    <w:p>
+      <w:pPr>
+        <w:pStyle w:val="ListBullet"/>
+      </w:pPr>
+      <w:r>
+        <w:t>The heartbeat/pulse check (Layer 3, rPPG) still does not produce a real pass or fail live, as described in Phase 12 -- this is a real architecture limit (the live frame rate during that check is too low for its underlying math), not something the next code change fixes on its own; it would need a faster frame-capture path to the check itself. A physically-tilted phone or photo held by hand, moved continuously during the attempt, has also not been proven caught live end to end, even though the trained model behind it catches it reliably offline against real captured attack photos.</w:t>
       </w:r>
     </w:p>
     <w:p>

</xml_diff>

<commit_message>
Doc hygiene: remove stale PDF exports, correct two overclaiming references
Final_Report.pdf, Final_Report_Formatted.pdf, and Final_Report_Full.pdf
were all stale exports (Aug 6-7) that no longer matched the .docx after
Phase 11/12 were added, and there's no PDF converter on this machine to
regenerate them -- a stale duplicate is more misleading than none, so
removed rather than left to drift further. Added a dated update note to
final_confirmation_report.md pointing forward to Phase 11/12 rather than
rewriting its historical content (same discipline Evaluation_Report.md's
Section 5.1.3 correction already uses: leave superseded numbers auditable,
don't silently replace them). Corrected the Full Report's own "Final
confirmation pass" bullet, which had started overclaiming finality now
that real work continued past the date it described.

Co-Authored-By: Claude Sonnet 5 <noreply@anthropic.com>
</commit_message>
<xml_diff>
--- a/docs/Final_Report_Full.docx
+++ b/docs/Final_Report_Full.docx
@@ -2794,11 +2794,9 @@
         </w:rPr>
       </w:pPr>
       <w:r>
-        <w:t xml:space="preserve">Final confirmation pass. This document, together with docs/final_confirmation_report.md, is that pass — a fresh run of the full automated test suite and every evaluation script against the current, fully-updated system, confirming what's genuinely fixed, what's deliberately left open by design, and what still needs a human to close </w:t>
-      </w:r>
-      <w:r>
-        <w:t>out.</w:t>
-      </w:r>
+        <w:t>Final confirmation pass. docs/final_confirmation_report.md was that pass for the 5-phase stability/security work as of 2026-08-08 -- a fresh run of the full automated test suite and every evaluation script against the system as it stood then. Real work has continued since (Phase 11, Phase 12), so that document is no longer the final word on the system's current state; this report, kept current through Phase 12, is. The discipline itself -- confirm with a fresh run against real evidence rather than carrying old numbers forward -- is the same, applied again.</w:t>
+      </w:r>
+      <w:r/>
     </w:p>
     <w:p>
       <w:pPr>

</xml_diff>